<commit_message>
Added the most up to date document
Put the most recent ECR-008 file in document folder
</commit_message>
<xml_diff>
--- a/downloads/SOE - ECR-008 - HSRP.docx
+++ b/downloads/SOE - ECR-008 - HSRP.docx
@@ -1042,6 +1042,7 @@
             <w14:uncheckedState w14:val="2610" w14:font="MS Gothic"/>
           </w14:checkbox>
         </w:sdtPr>
+        <w:sdtEndPr/>
         <w:sdtContent>
           <w:r>
             <w:rPr>
@@ -2596,6 +2597,7 @@
             <w14:uncheckedState w14:val="2610" w14:font="MS Gothic"/>
           </w14:checkbox>
         </w:sdtPr>
+        <w:sdtEndPr/>
         <w:sdtContent>
           <w:r>
             <w:rPr>
@@ -3121,6 +3123,7 @@
             <w14:uncheckedState w14:val="2610" w14:font="MS Gothic"/>
           </w14:checkbox>
         </w:sdtPr>
+        <w:sdtEndPr/>
         <w:sdtContent>
           <w:r>
             <w:rPr>
@@ -4458,6 +4461,7 @@
             <w14:uncheckedState w14:val="2610" w14:font="MS Gothic"/>
           </w14:checkbox>
         </w:sdtPr>
+        <w:sdtEndPr/>
         <w:sdtContent>
           <w:r>
             <w:rPr>
@@ -5444,6 +5448,7 @@
             <w14:uncheckedState w14:val="2610" w14:font="MS Gothic"/>
           </w14:checkbox>
         </w:sdtPr>
+        <w:sdtEndPr/>
         <w:sdtContent>
           <w:r>
             <w:rPr>
@@ -7180,6 +7185,7 @@
               <w14:uncheckedState w14:val="2610" w14:font="MS Gothic"/>
             </w14:checkbox>
           </w:sdtPr>
+          <w:sdtEndPr/>
           <w:sdtContent>
             <w:tc>
               <w:tcPr>
@@ -7227,6 +7233,7 @@
               <w14:uncheckedState w14:val="2610" w14:font="MS Gothic"/>
             </w14:checkbox>
           </w:sdtPr>
+          <w:sdtEndPr/>
           <w:sdtContent>
             <w:tc>
               <w:tcPr>
@@ -7282,6 +7289,7 @@
               <w14:uncheckedState w14:val="2610" w14:font="MS Gothic"/>
             </w14:checkbox>
           </w:sdtPr>
+          <w:sdtEndPr/>
           <w:sdtContent>
             <w:tc>
               <w:tcPr>
@@ -7336,6 +7344,7 @@
               <w14:uncheckedState w14:val="2610" w14:font="MS Gothic"/>
             </w14:checkbox>
           </w:sdtPr>
+          <w:sdtEndPr/>
           <w:sdtContent>
             <w:tc>
               <w:tcPr>
@@ -7847,6 +7856,7 @@
               <w14:uncheckedState w14:val="2610" w14:font="MS Gothic"/>
             </w14:checkbox>
           </w:sdtPr>
+          <w:sdtEndPr/>
           <w:sdtContent>
             <w:tc>
               <w:tcPr>
@@ -7877,6 +7887,7 @@
               <w14:uncheckedState w14:val="2610" w14:font="MS Gothic"/>
             </w14:checkbox>
           </w:sdtPr>
+          <w:sdtEndPr/>
           <w:sdtContent>
             <w:tc>
               <w:tcPr>
@@ -7939,6 +7950,7 @@
               <w14:uncheckedState w14:val="2610" w14:font="MS Gothic"/>
             </w14:checkbox>
           </w:sdtPr>
+          <w:sdtEndPr/>
           <w:sdtContent>
             <w:tc>
               <w:tcPr>
@@ -7969,6 +7981,7 @@
               <w14:uncheckedState w14:val="2610" w14:font="MS Gothic"/>
             </w14:checkbox>
           </w:sdtPr>
+          <w:sdtEndPr/>
           <w:sdtContent>
             <w:tc>
               <w:tcPr>
@@ -8034,6 +8047,7 @@
               <w14:uncheckedState w14:val="2610" w14:font="MS Gothic"/>
             </w14:checkbox>
           </w:sdtPr>
+          <w:sdtEndPr/>
           <w:sdtContent>
             <w:tc>
               <w:tcPr>
@@ -8064,6 +8078,7 @@
               <w14:uncheckedState w14:val="2610" w14:font="MS Gothic"/>
             </w14:checkbox>
           </w:sdtPr>
+          <w:sdtEndPr/>
           <w:sdtContent>
             <w:tc>
               <w:tcPr>
@@ -8124,6 +8139,7 @@
               <w14:uncheckedState w14:val="2610" w14:font="MS Gothic"/>
             </w14:checkbox>
           </w:sdtPr>
+          <w:sdtEndPr/>
           <w:sdtContent>
             <w:tc>
               <w:tcPr>
@@ -8153,6 +8169,7 @@
               <w14:uncheckedState w14:val="2610" w14:font="MS Gothic"/>
             </w14:checkbox>
           </w:sdtPr>
+          <w:sdtEndPr/>
           <w:sdtContent>
             <w:tc>
               <w:tcPr>
@@ -8433,6 +8450,7 @@
               <w14:uncheckedState w14:val="2610" w14:font="MS Gothic"/>
             </w14:checkbox>
           </w:sdtPr>
+          <w:sdtEndPr/>
           <w:sdtContent>
             <w:tc>
               <w:tcPr>
@@ -8463,6 +8481,7 @@
               <w14:uncheckedState w14:val="2610" w14:font="MS Gothic"/>
             </w14:checkbox>
           </w:sdtPr>
+          <w:sdtEndPr/>
           <w:sdtContent>
             <w:tc>
               <w:tcPr>
@@ -8526,6 +8545,7 @@
               <w14:uncheckedState w14:val="2610" w14:font="MS Gothic"/>
             </w14:checkbox>
           </w:sdtPr>
+          <w:sdtEndPr/>
           <w:sdtContent>
             <w:tc>
               <w:tcPr>
@@ -8556,6 +8576,7 @@
               <w14:uncheckedState w14:val="2610" w14:font="MS Gothic"/>
             </w14:checkbox>
           </w:sdtPr>
+          <w:sdtEndPr/>
           <w:sdtContent>
             <w:tc>
               <w:tcPr>
@@ -8621,6 +8642,7 @@
               <w14:uncheckedState w14:val="2610" w14:font="MS Gothic"/>
             </w14:checkbox>
           </w:sdtPr>
+          <w:sdtEndPr/>
           <w:sdtContent>
             <w:tc>
               <w:tcPr>
@@ -8651,6 +8673,7 @@
               <w14:uncheckedState w14:val="2610" w14:font="MS Gothic"/>
             </w14:checkbox>
           </w:sdtPr>
+          <w:sdtEndPr/>
           <w:sdtContent>
             <w:tc>
               <w:tcPr>
@@ -8710,6 +8733,7 @@
               <w14:uncheckedState w14:val="2610" w14:font="MS Gothic"/>
             </w14:checkbox>
           </w:sdtPr>
+          <w:sdtEndPr/>
           <w:sdtContent>
             <w:tc>
               <w:tcPr>
@@ -8740,6 +8764,7 @@
               <w14:uncheckedState w14:val="2610" w14:font="MS Gothic"/>
             </w14:checkbox>
           </w:sdtPr>
+          <w:sdtEndPr/>
           <w:sdtContent>
             <w:tc>
               <w:tcPr>
@@ -9034,6 +9059,7 @@
               <w14:uncheckedState w14:val="2610" w14:font="MS Gothic"/>
             </w14:checkbox>
           </w:sdtPr>
+          <w:sdtEndPr/>
           <w:sdtContent>
             <w:tc>
               <w:tcPr>
@@ -9064,6 +9090,7 @@
               <w14:uncheckedState w14:val="2610" w14:font="MS Gothic"/>
             </w14:checkbox>
           </w:sdtPr>
+          <w:sdtEndPr/>
           <w:sdtContent>
             <w:tc>
               <w:tcPr>
@@ -9132,6 +9159,7 @@
               <w14:uncheckedState w14:val="2610" w14:font="MS Gothic"/>
             </w14:checkbox>
           </w:sdtPr>
+          <w:sdtEndPr/>
           <w:sdtContent>
             <w:tc>
               <w:tcPr>
@@ -9161,6 +9189,7 @@
               <w14:uncheckedState w14:val="2610" w14:font="MS Gothic"/>
             </w14:checkbox>
           </w:sdtPr>
+          <w:sdtEndPr/>
           <w:sdtContent>
             <w:tc>
               <w:tcPr>
@@ -9430,6 +9459,7 @@
               <w14:uncheckedState w14:val="2610" w14:font="MS Gothic"/>
             </w14:checkbox>
           </w:sdtPr>
+          <w:sdtEndPr/>
           <w:sdtContent>
             <w:tc>
               <w:tcPr>
@@ -9460,6 +9490,7 @@
               <w14:uncheckedState w14:val="2610" w14:font="MS Gothic"/>
             </w14:checkbox>
           </w:sdtPr>
+          <w:sdtEndPr/>
           <w:sdtContent>
             <w:tc>
               <w:tcPr>
@@ -9754,6 +9785,7 @@
               <w14:uncheckedState w14:val="2610" w14:font="MS Gothic"/>
             </w14:checkbox>
           </w:sdtPr>
+          <w:sdtEndPr/>
           <w:sdtContent>
             <w:tc>
               <w:tcPr>
@@ -9784,6 +9816,7 @@
               <w14:uncheckedState w14:val="2610" w14:font="MS Gothic"/>
             </w14:checkbox>
           </w:sdtPr>
+          <w:sdtEndPr/>
           <w:sdtContent>
             <w:tc>
               <w:tcPr>
@@ -9842,6 +9875,7 @@
               <w14:uncheckedState w14:val="2610" w14:font="MS Gothic"/>
             </w14:checkbox>
           </w:sdtPr>
+          <w:sdtEndPr/>
           <w:sdtContent>
             <w:tc>
               <w:tcPr>
@@ -9871,6 +9905,7 @@
               <w14:uncheckedState w14:val="2610" w14:font="MS Gothic"/>
             </w14:checkbox>
           </w:sdtPr>
+          <w:sdtEndPr/>
           <w:sdtContent>
             <w:tc>
               <w:tcPr>
@@ -10086,6 +10121,7 @@
               <w14:uncheckedState w14:val="2610" w14:font="MS Gothic"/>
             </w14:checkbox>
           </w:sdtPr>
+          <w:sdtEndPr/>
           <w:sdtContent>
             <w:tc>
               <w:tcPr>
@@ -10116,6 +10152,7 @@
               <w14:uncheckedState w14:val="2610" w14:font="MS Gothic"/>
             </w14:checkbox>
           </w:sdtPr>
+          <w:sdtEndPr/>
           <w:sdtContent>
             <w:tc>
               <w:tcPr>
@@ -10174,6 +10211,7 @@
               <w14:uncheckedState w14:val="2610" w14:font="MS Gothic"/>
             </w14:checkbox>
           </w:sdtPr>
+          <w:sdtEndPr/>
           <w:sdtContent>
             <w:tc>
               <w:tcPr>
@@ -10203,6 +10241,7 @@
               <w14:uncheckedState w14:val="2610" w14:font="MS Gothic"/>
             </w14:checkbox>
           </w:sdtPr>
+          <w:sdtEndPr/>
           <w:sdtContent>
             <w:tc>
               <w:tcPr>
@@ -10460,6 +10499,7 @@
               <w14:uncheckedState w14:val="2610" w14:font="MS Gothic"/>
             </w14:checkbox>
           </w:sdtPr>
+          <w:sdtEndPr/>
           <w:sdtContent>
             <w:tc>
               <w:tcPr>
@@ -10490,6 +10530,7 @@
               <w14:uncheckedState w14:val="2610" w14:font="MS Gothic"/>
             </w14:checkbox>
           </w:sdtPr>
+          <w:sdtEndPr/>
           <w:sdtContent>
             <w:tc>
               <w:tcPr>
@@ -10713,6 +10754,7 @@
               <w14:uncheckedState w14:val="2610" w14:font="MS Gothic"/>
             </w14:checkbox>
           </w:sdtPr>
+          <w:sdtEndPr/>
           <w:sdtContent>
             <w:tc>
               <w:tcPr>
@@ -10742,6 +10784,7 @@
               <w14:uncheckedState w14:val="2610" w14:font="MS Gothic"/>
             </w14:checkbox>
           </w:sdtPr>
+          <w:sdtEndPr/>
           <w:sdtContent>
             <w:tc>
               <w:tcPr>
@@ -10979,6 +11022,7 @@
               <w14:uncheckedState w14:val="2610" w14:font="MS Gothic"/>
             </w14:checkbox>
           </w:sdtPr>
+          <w:sdtEndPr/>
           <w:sdtContent>
             <w:tc>
               <w:tcPr>
@@ -11009,6 +11053,7 @@
               <w14:uncheckedState w14:val="2610" w14:font="MS Gothic"/>
             </w14:checkbox>
           </w:sdtPr>
+          <w:sdtEndPr/>
           <w:sdtContent>
             <w:tc>
               <w:tcPr>
@@ -12139,6 +12184,7 @@
               <w14:uncheckedState w14:val="2610" w14:font="MS Gothic"/>
             </w14:checkbox>
           </w:sdtPr>
+          <w:sdtEndPr/>
           <w:sdtContent>
             <w:tc>
               <w:tcPr>
@@ -12186,6 +12232,7 @@
               <w14:uncheckedState w14:val="2610" w14:font="MS Gothic"/>
             </w14:checkbox>
           </w:sdtPr>
+          <w:sdtEndPr/>
           <w:sdtContent>
             <w:tc>
               <w:tcPr>
@@ -12235,6 +12282,7 @@
               <w14:uncheckedState w14:val="2610" w14:font="MS Gothic"/>
             </w14:checkbox>
           </w:sdtPr>
+          <w:sdtEndPr/>
           <w:sdtContent>
             <w:tc>
               <w:tcPr>
@@ -12722,6 +12770,7 @@
               <w14:uncheckedState w14:val="2610" w14:font="MS Gothic"/>
             </w14:checkbox>
           </w:sdtPr>
+          <w:sdtEndPr/>
           <w:sdtContent>
             <w:tc>
               <w:tcPr>
@@ -12752,6 +12801,7 @@
               <w14:uncheckedState w14:val="2610" w14:font="MS Gothic"/>
             </w14:checkbox>
           </w:sdtPr>
+          <w:sdtEndPr/>
           <w:sdtContent>
             <w:tc>
               <w:tcPr>
@@ -12828,6 +12878,7 @@
               <w14:uncheckedState w14:val="2610" w14:font="MS Gothic"/>
             </w14:checkbox>
           </w:sdtPr>
+          <w:sdtEndPr/>
           <w:sdtContent>
             <w:tc>
               <w:tcPr>
@@ -12861,6 +12912,7 @@
               <w14:uncheckedState w14:val="2610" w14:font="MS Gothic"/>
             </w14:checkbox>
           </w:sdtPr>
+          <w:sdtEndPr/>
           <w:sdtContent>
             <w:tc>
               <w:tcPr>
@@ -13131,6 +13183,7 @@
               <w14:uncheckedState w14:val="2610" w14:font="MS Gothic"/>
             </w14:checkbox>
           </w:sdtPr>
+          <w:sdtEndPr/>
           <w:sdtContent>
             <w:tc>
               <w:tcPr>
@@ -13161,6 +13214,7 @@
               <w14:uncheckedState w14:val="2610" w14:font="MS Gothic"/>
             </w14:checkbox>
           </w:sdtPr>
+          <w:sdtEndPr/>
           <w:sdtContent>
             <w:tc>
               <w:tcPr>
@@ -13420,6 +13474,7 @@
               <w14:uncheckedState w14:val="2610" w14:font="MS Gothic"/>
             </w14:checkbox>
           </w:sdtPr>
+          <w:sdtEndPr/>
           <w:sdtContent>
             <w:tc>
               <w:tcPr>
@@ -13450,6 +13505,7 @@
               <w14:uncheckedState w14:val="2610" w14:font="MS Gothic"/>
             </w14:checkbox>
           </w:sdtPr>
+          <w:sdtEndPr/>
           <w:sdtContent>
             <w:tc>
               <w:tcPr>
@@ -13512,6 +13568,7 @@
               <w14:uncheckedState w14:val="2610" w14:font="MS Gothic"/>
             </w14:checkbox>
           </w:sdtPr>
+          <w:sdtEndPr/>
           <w:sdtContent>
             <w:tc>
               <w:tcPr>
@@ -13542,6 +13599,7 @@
               <w14:uncheckedState w14:val="2610" w14:font="MS Gothic"/>
             </w14:checkbox>
           </w:sdtPr>
+          <w:sdtEndPr/>
           <w:sdtContent>
             <w:tc>
               <w:tcPr>
@@ -14377,6 +14435,7 @@
               <w14:uncheckedState w14:val="2610" w14:font="MS Gothic"/>
             </w14:checkbox>
           </w:sdtPr>
+          <w:sdtEndPr/>
           <w:sdtContent>
             <w:tc>
               <w:tcPr>
@@ -14433,6 +14492,7 @@
               <w14:uncheckedState w14:val="2610" w14:font="MS Gothic"/>
             </w14:checkbox>
           </w:sdtPr>
+          <w:sdtEndPr/>
           <w:sdtContent>
             <w:tc>
               <w:tcPr>
@@ -14479,6 +14539,7 @@
               <w14:uncheckedState w14:val="2610" w14:font="MS Gothic"/>
             </w14:checkbox>
           </w:sdtPr>
+          <w:sdtEndPr/>
           <w:sdtContent>
             <w:tc>
               <w:tcPr>
@@ -14524,6 +14585,7 @@
               <w14:uncheckedState w14:val="2610" w14:font="MS Gothic"/>
             </w14:checkbox>
           </w:sdtPr>
+          <w:sdtEndPr/>
           <w:sdtContent>
             <w:tc>
               <w:tcPr>
@@ -17056,6 +17118,7 @@
             <w14:uncheckedState w14:val="2610" w14:font="MS Gothic"/>
           </w14:checkbox>
         </w:sdtPr>
+        <w:sdtEndPr/>
         <w:sdtContent>
           <w:r>
             <w:rPr>
@@ -17098,7 +17161,7 @@
     </w:p>
     <w:p>
       <w:pPr>
-        <w:pStyle w:val="pdq2pgselectionanchorcontainer"/>
+        <w:pStyle w:val="gjcqjg1a"/>
       </w:pPr>
       <w:r>
         <w:t xml:space="preserve">Open the </w:t>
@@ -17110,13 +17173,13 @@
         <w:t>Sonoran Outdoor Equipment Enterprise Network Standards Guide</w:t>
       </w:r>
       <w:r>
-        <w:t xml:space="preserve"> and complete the </w:t>
+        <w:t xml:space="preserve"> and locate the </w:t>
       </w:r>
       <w:r>
         <w:rPr>
           <w:rStyle w:val="Strong"/>
         </w:rPr>
-        <w:t>ECR-008 – HSRP and Network Redundancy Standards Update</w:t>
+        <w:t>Enterprise Standards Addendum – First-Hop Redundancy</w:t>
       </w:r>
       <w:r>
         <w:t xml:space="preserve"> section.</w:t>
@@ -17127,69 +17190,166 @@
         <w:pStyle w:val="NormalWeb"/>
       </w:pPr>
       <w:r>
-        <w:t>Update the appropriate tables and standards to document:</w:t>
+        <w:t xml:space="preserve">Using the HSRPv2 implementation completed and verified during this Enterprise Change Request, develop an </w:t>
+      </w:r>
+      <w:r>
+        <w:rPr>
+          <w:rStyle w:val="Strong"/>
+        </w:rPr>
+        <w:t>enterprise-wide first-hop redundancy standard</w:t>
+      </w:r>
+      <w:r>
+        <w:t xml:space="preserve"> that can be applied to future Sonoran Outdoor Equipment network deployments.</w:t>
+      </w:r>
+    </w:p>
+    <w:p>
+      <w:pPr>
+        <w:pStyle w:val="NormalWeb"/>
+      </w:pPr>
+      <w:r>
+        <w:t>Your proposed standard should address, as applicable:</w:t>
       </w:r>
     </w:p>
     <w:p>
       <w:pPr>
         <w:numPr>
           <w:ilvl w:val="0"/>
-          <w:numId w:val="28"/>
+          <w:numId w:val="29"/>
         </w:numPr>
         <w:spacing w:before="100" w:beforeAutospacing="1" w:after="100" w:afterAutospacing="1"/>
       </w:pPr>
       <w:r>
-        <w:t xml:space="preserve">HQ-R2 hardware and device information. </w:t>
+        <w:lastRenderedPageBreak/>
+        <w:t xml:space="preserve">The approved first-hop redundancy protocol. </w:t>
       </w:r>
     </w:p>
     <w:p>
       <w:pPr>
         <w:numPr>
           <w:ilvl w:val="0"/>
-          <w:numId w:val="28"/>
+          <w:numId w:val="29"/>
         </w:numPr>
         <w:spacing w:before="100" w:beforeAutospacing="1" w:after="100" w:afterAutospacing="1"/>
       </w:pPr>
       <w:r>
-        <w:t xml:space="preserve">New and updated HQ-R2 router interface information. </w:t>
+        <w:t xml:space="preserve">The virtual default gateway addressing convention. </w:t>
       </w:r>
     </w:p>
     <w:p>
       <w:pPr>
         <w:numPr>
           <w:ilvl w:val="0"/>
-          <w:numId w:val="28"/>
+          <w:numId w:val="29"/>
         </w:numPr>
         <w:spacing w:before="100" w:beforeAutospacing="1" w:after="100" w:afterAutospacing="1"/>
       </w:pPr>
       <w:r>
-        <w:t xml:space="preserve">The new HQ-R2 to TUC-R2 private WAN connection. </w:t>
+        <w:t xml:space="preserve">The relationship between virtual gateway addresses and physical router interface addresses. </w:t>
       </w:r>
     </w:p>
     <w:p>
       <w:pPr>
         <w:numPr>
           <w:ilvl w:val="0"/>
-          <w:numId w:val="28"/>
+          <w:numId w:val="29"/>
         </w:numPr>
         <w:spacing w:before="100" w:beforeAutospacing="1" w:after="100" w:afterAutospacing="1"/>
       </w:pPr>
       <w:r>
-        <w:lastRenderedPageBreak/>
-        <w:t xml:space="preserve">Enterprise HSRPv2 implementation standards, including the approved virtual gateway and redundancy design. </w:t>
+        <w:t xml:space="preserve">The HSRP group-numbering convention. </w:t>
       </w:r>
     </w:p>
     <w:p>
       <w:pPr>
         <w:numPr>
           <w:ilvl w:val="0"/>
-          <w:numId w:val="28"/>
+          <w:numId w:val="29"/>
         </w:numPr>
         <w:spacing w:before="100" w:beforeAutospacing="1" w:after="100" w:afterAutospacing="1"/>
       </w:pPr>
       <w:r>
-        <w:t xml:space="preserve">Any additional enterprise standards introduced or modified by this Enterprise Change Request. </w:t>
-      </w:r>
+        <w:t xml:space="preserve">Active and standby router roles. </w:t>
+      </w:r>
+    </w:p>
+    <w:p>
+      <w:pPr>
+        <w:numPr>
+          <w:ilvl w:val="0"/>
+          <w:numId w:val="29"/>
+        </w:numPr>
+        <w:spacing w:before="100" w:beforeAutospacing="1" w:after="100" w:afterAutospacing="1"/>
+      </w:pPr>
+      <w:r>
+        <w:t xml:space="preserve">Priority and preemption requirements. </w:t>
+      </w:r>
+    </w:p>
+    <w:p>
+      <w:pPr>
+        <w:numPr>
+          <w:ilvl w:val="0"/>
+          <w:numId w:val="29"/>
+        </w:numPr>
+        <w:spacing w:before="100" w:beforeAutospacing="1" w:after="100" w:afterAutospacing="1"/>
+      </w:pPr>
+      <w:r>
+        <w:t xml:space="preserve">IPv4 and IPv6 redundancy requirements. </w:t>
+      </w:r>
+    </w:p>
+    <w:p>
+      <w:pPr>
+        <w:numPr>
+          <w:ilvl w:val="0"/>
+          <w:numId w:val="29"/>
+        </w:numPr>
+        <w:spacing w:before="100" w:beforeAutospacing="1" w:after="100" w:afterAutospacing="1"/>
+      </w:pPr>
+      <w:r>
+        <w:t xml:space="preserve">Verification requirements following implementation. </w:t>
+      </w:r>
+    </w:p>
+    <w:p>
+      <w:pPr>
+        <w:pStyle w:val="NormalWeb"/>
+      </w:pPr>
+      <w:r>
+        <w:t xml:space="preserve">Write the standard as an </w:t>
+      </w:r>
+      <w:r>
+        <w:rPr>
+          <w:rStyle w:val="Strong"/>
+        </w:rPr>
+        <w:t>enterprise policy</w:t>
+      </w:r>
+      <w:r>
+        <w:t>, not as a description of the specific HQ-R1 and HQ-R2 configuration.</w:t>
+      </w:r>
+    </w:p>
+    <w:p>
+      <w:pPr>
+        <w:pStyle w:val="NormalWeb"/>
+      </w:pPr>
+      <w:r>
+        <w:t xml:space="preserve">Complete the </w:t>
+      </w:r>
+      <w:r>
+        <w:rPr>
+          <w:rStyle w:val="Strong"/>
+        </w:rPr>
+        <w:t>Enterprise Standards Addendum – First-Hop Redundancy</w:t>
+      </w:r>
+      <w:r>
+        <w:t xml:space="preserve"> section of the Enterprise Network Standards Guide and include the updated guide with your ECR deliverables.</w:t>
+      </w:r>
+    </w:p>
+    <w:p>
+      <w:pPr>
+        <w:pStyle w:val="NormalWeb"/>
+      </w:pPr>
+    </w:p>
+    <w:p>
+      <w:pPr>
+        <w:pStyle w:val="NormalWeb"/>
+      </w:pPr>
     </w:p>
     <w:p>
       <w:pPr>
@@ -17215,6 +17375,7 @@
     <w:p>
       <w:pPr>
         <w:pStyle w:val="Important"/>
+        <w:spacing w:before="240"/>
         <w:rPr>
           <w:b w:val="0"/>
         </w:rPr>
@@ -17223,7 +17384,7 @@
         <w:rPr>
           <w:b w:val="0"/>
         </w:rPr>
-        <w:t>Complete the ECR-008 standards update only after the implementation has been configured and successfully validated. Do not overwrite the original baseline standards unless specifically directed by the ECR.</w:t>
+        <w:t>Your proposed standard must be consistent with the HSRPv2 implementation requirements established and successfully validated during this Enterprise Change Request. Do not modify existing enterprise standards that are unrelated to first-hop redundancy.</w:t>
       </w:r>
     </w:p>
     <w:p>
@@ -17390,7 +17551,7 @@
           <w:color w:val="4F6228" w:themeColor="accent3" w:themeShade="80"/>
         </w:rPr>
         <w:pict>
-          <v:rect id="_x0000_i1060" style="width:468pt;height:2.5pt" o:hralign="center" o:hrstd="t" o:hrnoshade="t" o:hr="t" fillcolor="#4e6128 [1606]" stroked="f"/>
+          <v:rect id="_x0000_i1059" style="width:468pt;height:2.5pt" o:hralign="center" o:hrstd="t" o:hrnoshade="t" o:hr="t" fillcolor="#4e6128 [1606]" stroked="f"/>
         </w:pict>
       </w:r>
     </w:p>
@@ -17415,6 +17576,7 @@
             <w14:uncheckedState w14:val="2610" w14:font="MS Gothic"/>
           </w14:checkbox>
         </w:sdtPr>
+        <w:sdtEndPr/>
         <w:sdtContent>
           <w:r>
             <w:rPr>
@@ -17438,6 +17600,7 @@
             <w14:uncheckedState w14:val="2610" w14:font="MS Gothic"/>
           </w14:checkbox>
         </w:sdtPr>
+        <w:sdtEndPr/>
         <w:sdtContent>
           <w:r>
             <w:rPr>
@@ -17461,6 +17624,7 @@
             <w14:uncheckedState w14:val="2610" w14:font="MS Gothic"/>
           </w14:checkbox>
         </w:sdtPr>
+        <w:sdtEndPr/>
         <w:sdtContent>
           <w:r>
             <w:rPr>
@@ -17474,18 +17638,8 @@
         <w:t xml:space="preserve">  </w:t>
       </w:r>
       <w:r>
-        <w:t xml:space="preserve">Updated Enterprise Network Standards Guide – </w:t>
-      </w:r>
-    </w:p>
-    <w:p>
-      <w:pPr>
-        <w:ind w:firstLine="720"/>
-      </w:pPr>
-      <w:r>
-        <w:t>ECR-008 HSRP and Network Redundancy Standards Update</w:t>
-      </w:r>
-    </w:p>
-    <w:p>
+        <w:t>Updated Enterprise Network Standards Guide – First-Hop Redundancy Standards Addendum</w:t>
+      </w:r>
       <w:sdt>
         <w:sdtPr>
           <w:id w:val="-397751034"/>
@@ -17495,6 +17649,7 @@
             <w14:uncheckedState w14:val="2610" w14:font="MS Gothic"/>
           </w14:checkbox>
         </w:sdtPr>
+        <w:sdtEndPr/>
         <w:sdtContent>
           <w:r>
             <w:rPr>
@@ -17508,15 +17663,7 @@
         <w:t xml:space="preserve">  </w:t>
       </w:r>
       <w:r>
-        <w:t xml:space="preserve">Updated Enterprise IP Addressing Plan – </w:t>
-      </w:r>
-    </w:p>
-    <w:p>
-      <w:pPr>
-        <w:ind w:firstLine="720"/>
-      </w:pPr>
-      <w:r>
-        <w:t>ECR-008 HSRP Addressing Update Addendum</w:t>
+        <w:t>Updated Enterprise IP Addressing Plan – ECR-008 HSRP Addressing Update Addendum</w:t>
       </w:r>
     </w:p>
     <w:p>
@@ -17529,6 +17676,7 @@
             <w14:uncheckedState w14:val="2610" w14:font="MS Gothic"/>
           </w14:checkbox>
         </w:sdtPr>
+        <w:sdtEndPr/>
         <w:sdtContent>
           <w:r>
             <w:rPr>
@@ -17552,6 +17700,7 @@
             <w14:uncheckedState w14:val="2610" w14:font="MS Gothic"/>
           </w14:checkbox>
         </w:sdtPr>
+        <w:sdtEndPr/>
         <w:sdtContent>
           <w:r>
             <w:rPr>
@@ -17581,7 +17730,7 @@
           <w:color w:val="4F6228" w:themeColor="accent3" w:themeShade="80"/>
         </w:rPr>
         <w:pict>
-          <v:rect id="_x0000_i1059" style="width:468pt;height:2.5pt" o:hralign="center" o:hrstd="t" o:hrnoshade="t" o:hr="t" fillcolor="#4e6128 [1606]" stroked="f"/>
+          <v:rect id="_x0000_i1060" style="width:468pt;height:2.5pt" o:hralign="center" o:hrstd="t" o:hrnoshade="t" o:hr="t" fillcolor="#4e6128 [1606]" stroked="f"/>
         </w:pict>
       </w:r>
       <w:r>
@@ -17598,18 +17747,26 @@
           <w:sz w:val="18"/>
           <w:szCs w:val="18"/>
         </w:rPr>
-        <w:t>pdated 08/20</w:t>
-      </w:r>
-      <w:bookmarkStart w:id="0" w:name="_GoBack"/>
-      <w:bookmarkEnd w:id="0"/>
+        <w:t>pdated 08/2</w:t>
+      </w:r>
       <w:r>
         <w:rPr>
           <w:color w:val="4F6228" w:themeColor="accent3" w:themeShade="80"/>
           <w:sz w:val="18"/>
           <w:szCs w:val="18"/>
         </w:rPr>
+        <w:t>2</w:t>
+      </w:r>
+      <w:r>
+        <w:rPr>
+          <w:color w:val="4F6228" w:themeColor="accent3" w:themeShade="80"/>
+          <w:sz w:val="18"/>
+          <w:szCs w:val="18"/>
+        </w:rPr>
         <w:t>/2026</w:t>
       </w:r>
+      <w:bookmarkStart w:id="0" w:name="_GoBack"/>
+      <w:bookmarkEnd w:id="0"/>
     </w:p>
     <w:sectPr>
       <w:headerReference w:type="even" r:id="rId8"/>
@@ -18917,6 +19074,155 @@
     </w:lvl>
   </w:abstractNum>
   <w:abstractNum w:abstractNumId="13" w15:restartNumberingAfterBreak="0">
+    <w:nsid w:val="1B7766A1"/>
+    <w:multiLevelType w:val="multilevel"/>
+    <w:tmpl w:val="1D08433A"/>
+    <w:lvl w:ilvl="0">
+      <w:start w:val="1"/>
+      <w:numFmt w:val="bullet"/>
+      <w:lvlText w:val=""/>
+      <w:lvlJc w:val="left"/>
+      <w:pPr>
+        <w:tabs>
+          <w:tab w:val="num" w:pos="720"/>
+        </w:tabs>
+        <w:ind w:left="720" w:hanging="360"/>
+      </w:pPr>
+      <w:rPr>
+        <w:rFonts w:ascii="Symbol" w:hAnsi="Symbol" w:hint="default"/>
+        <w:sz w:val="20"/>
+      </w:rPr>
+    </w:lvl>
+    <w:lvl w:ilvl="1" w:tentative="1">
+      <w:start w:val="1"/>
+      <w:numFmt w:val="bullet"/>
+      <w:lvlText w:val="o"/>
+      <w:lvlJc w:val="left"/>
+      <w:pPr>
+        <w:tabs>
+          <w:tab w:val="num" w:pos="1440"/>
+        </w:tabs>
+        <w:ind w:left="1440" w:hanging="360"/>
+      </w:pPr>
+      <w:rPr>
+        <w:rFonts w:ascii="Courier New" w:hAnsi="Courier New" w:hint="default"/>
+        <w:sz w:val="20"/>
+      </w:rPr>
+    </w:lvl>
+    <w:lvl w:ilvl="2" w:tentative="1">
+      <w:start w:val="1"/>
+      <w:numFmt w:val="bullet"/>
+      <w:lvlText w:val=""/>
+      <w:lvlJc w:val="left"/>
+      <w:pPr>
+        <w:tabs>
+          <w:tab w:val="num" w:pos="2160"/>
+        </w:tabs>
+        <w:ind w:left="2160" w:hanging="360"/>
+      </w:pPr>
+      <w:rPr>
+        <w:rFonts w:ascii="Wingdings" w:hAnsi="Wingdings" w:hint="default"/>
+        <w:sz w:val="20"/>
+      </w:rPr>
+    </w:lvl>
+    <w:lvl w:ilvl="3" w:tentative="1">
+      <w:start w:val="1"/>
+      <w:numFmt w:val="bullet"/>
+      <w:lvlText w:val=""/>
+      <w:lvlJc w:val="left"/>
+      <w:pPr>
+        <w:tabs>
+          <w:tab w:val="num" w:pos="2880"/>
+        </w:tabs>
+        <w:ind w:left="2880" w:hanging="360"/>
+      </w:pPr>
+      <w:rPr>
+        <w:rFonts w:ascii="Wingdings" w:hAnsi="Wingdings" w:hint="default"/>
+        <w:sz w:val="20"/>
+      </w:rPr>
+    </w:lvl>
+    <w:lvl w:ilvl="4" w:tentative="1">
+      <w:start w:val="1"/>
+      <w:numFmt w:val="bullet"/>
+      <w:lvlText w:val=""/>
+      <w:lvlJc w:val="left"/>
+      <w:pPr>
+        <w:tabs>
+          <w:tab w:val="num" w:pos="3600"/>
+        </w:tabs>
+        <w:ind w:left="3600" w:hanging="360"/>
+      </w:pPr>
+      <w:rPr>
+        <w:rFonts w:ascii="Wingdings" w:hAnsi="Wingdings" w:hint="default"/>
+        <w:sz w:val="20"/>
+      </w:rPr>
+    </w:lvl>
+    <w:lvl w:ilvl="5" w:tentative="1">
+      <w:start w:val="1"/>
+      <w:numFmt w:val="bullet"/>
+      <w:lvlText w:val=""/>
+      <w:lvlJc w:val="left"/>
+      <w:pPr>
+        <w:tabs>
+          <w:tab w:val="num" w:pos="4320"/>
+        </w:tabs>
+        <w:ind w:left="4320" w:hanging="360"/>
+      </w:pPr>
+      <w:rPr>
+        <w:rFonts w:ascii="Wingdings" w:hAnsi="Wingdings" w:hint="default"/>
+        <w:sz w:val="20"/>
+      </w:rPr>
+    </w:lvl>
+    <w:lvl w:ilvl="6" w:tentative="1">
+      <w:start w:val="1"/>
+      <w:numFmt w:val="bullet"/>
+      <w:lvlText w:val=""/>
+      <w:lvlJc w:val="left"/>
+      <w:pPr>
+        <w:tabs>
+          <w:tab w:val="num" w:pos="5040"/>
+        </w:tabs>
+        <w:ind w:left="5040" w:hanging="360"/>
+      </w:pPr>
+      <w:rPr>
+        <w:rFonts w:ascii="Wingdings" w:hAnsi="Wingdings" w:hint="default"/>
+        <w:sz w:val="20"/>
+      </w:rPr>
+    </w:lvl>
+    <w:lvl w:ilvl="7" w:tentative="1">
+      <w:start w:val="1"/>
+      <w:numFmt w:val="bullet"/>
+      <w:lvlText w:val=""/>
+      <w:lvlJc w:val="left"/>
+      <w:pPr>
+        <w:tabs>
+          <w:tab w:val="num" w:pos="5760"/>
+        </w:tabs>
+        <w:ind w:left="5760" w:hanging="360"/>
+      </w:pPr>
+      <w:rPr>
+        <w:rFonts w:ascii="Wingdings" w:hAnsi="Wingdings" w:hint="default"/>
+        <w:sz w:val="20"/>
+      </w:rPr>
+    </w:lvl>
+    <w:lvl w:ilvl="8" w:tentative="1">
+      <w:start w:val="1"/>
+      <w:numFmt w:val="bullet"/>
+      <w:lvlText w:val=""/>
+      <w:lvlJc w:val="left"/>
+      <w:pPr>
+        <w:tabs>
+          <w:tab w:val="num" w:pos="6480"/>
+        </w:tabs>
+        <w:ind w:left="6480" w:hanging="360"/>
+      </w:pPr>
+      <w:rPr>
+        <w:rFonts w:ascii="Wingdings" w:hAnsi="Wingdings" w:hint="default"/>
+        <w:sz w:val="20"/>
+      </w:rPr>
+    </w:lvl>
+  </w:abstractNum>
+  <w:abstractNum w:abstractNumId="14" w15:restartNumberingAfterBreak="0">
     <w:nsid w:val="23175D91"/>
     <w:multiLevelType w:val="multilevel"/>
     <w:tmpl w:val="ABFEE14A"/>
@@ -19065,7 +19371,7 @@
       </w:rPr>
     </w:lvl>
   </w:abstractNum>
-  <w:abstractNum w:abstractNumId="14" w15:restartNumberingAfterBreak="0">
+  <w:abstractNum w:abstractNumId="15" w15:restartNumberingAfterBreak="0">
     <w:nsid w:val="326C1A3F"/>
     <w:multiLevelType w:val="multilevel"/>
     <w:tmpl w:val="489E34DA"/>
@@ -19214,7 +19520,7 @@
       </w:rPr>
     </w:lvl>
   </w:abstractNum>
-  <w:abstractNum w:abstractNumId="15" w15:restartNumberingAfterBreak="0">
+  <w:abstractNum w:abstractNumId="16" w15:restartNumberingAfterBreak="0">
     <w:nsid w:val="3DAB0D97"/>
     <w:multiLevelType w:val="hybridMultilevel"/>
     <w:tmpl w:val="C1BA991E"/>
@@ -19326,7 +19632,7 @@
       </w:rPr>
     </w:lvl>
   </w:abstractNum>
-  <w:abstractNum w:abstractNumId="16" w15:restartNumberingAfterBreak="0">
+  <w:abstractNum w:abstractNumId="17" w15:restartNumberingAfterBreak="0">
     <w:nsid w:val="4777598F"/>
     <w:multiLevelType w:val="multilevel"/>
     <w:tmpl w:val="F59AA186"/>
@@ -19475,7 +19781,7 @@
       </w:rPr>
     </w:lvl>
   </w:abstractNum>
-  <w:abstractNum w:abstractNumId="17" w15:restartNumberingAfterBreak="0">
+  <w:abstractNum w:abstractNumId="18" w15:restartNumberingAfterBreak="0">
     <w:nsid w:val="4AA308E5"/>
     <w:multiLevelType w:val="multilevel"/>
     <w:tmpl w:val="CEBA4984"/>
@@ -19624,7 +19930,7 @@
       </w:rPr>
     </w:lvl>
   </w:abstractNum>
-  <w:abstractNum w:abstractNumId="18" w15:restartNumberingAfterBreak="0">
+  <w:abstractNum w:abstractNumId="19" w15:restartNumberingAfterBreak="0">
     <w:nsid w:val="4E0F5C44"/>
     <w:multiLevelType w:val="multilevel"/>
     <w:tmpl w:val="B2FE36D0"/>
@@ -19773,7 +20079,7 @@
       </w:rPr>
     </w:lvl>
   </w:abstractNum>
-  <w:abstractNum w:abstractNumId="19" w15:restartNumberingAfterBreak="0">
+  <w:abstractNum w:abstractNumId="20" w15:restartNumberingAfterBreak="0">
     <w:nsid w:val="50B153D5"/>
     <w:multiLevelType w:val="hybridMultilevel"/>
     <w:tmpl w:val="8E32A808"/>
@@ -19885,7 +20191,7 @@
       </w:rPr>
     </w:lvl>
   </w:abstractNum>
-  <w:abstractNum w:abstractNumId="20" w15:restartNumberingAfterBreak="0">
+  <w:abstractNum w:abstractNumId="21" w15:restartNumberingAfterBreak="0">
     <w:nsid w:val="510731F2"/>
     <w:multiLevelType w:val="multilevel"/>
     <w:tmpl w:val="B7DA9BAC"/>
@@ -20034,7 +20340,7 @@
       </w:rPr>
     </w:lvl>
   </w:abstractNum>
-  <w:abstractNum w:abstractNumId="21" w15:restartNumberingAfterBreak="0">
+  <w:abstractNum w:abstractNumId="22" w15:restartNumberingAfterBreak="0">
     <w:nsid w:val="535C307A"/>
     <w:multiLevelType w:val="hybridMultilevel"/>
     <w:tmpl w:val="C68688E4"/>
@@ -20146,7 +20452,7 @@
       </w:rPr>
     </w:lvl>
   </w:abstractNum>
-  <w:abstractNum w:abstractNumId="22" w15:restartNumberingAfterBreak="0">
+  <w:abstractNum w:abstractNumId="23" w15:restartNumberingAfterBreak="0">
     <w:nsid w:val="539D756E"/>
     <w:multiLevelType w:val="multilevel"/>
     <w:tmpl w:val="33C09294"/>
@@ -20295,7 +20601,7 @@
       </w:rPr>
     </w:lvl>
   </w:abstractNum>
-  <w:abstractNum w:abstractNumId="23" w15:restartNumberingAfterBreak="0">
+  <w:abstractNum w:abstractNumId="24" w15:restartNumberingAfterBreak="0">
     <w:nsid w:val="5B4E0E95"/>
     <w:multiLevelType w:val="multilevel"/>
     <w:tmpl w:val="312E0D6A"/>
@@ -20444,7 +20750,7 @@
       </w:rPr>
     </w:lvl>
   </w:abstractNum>
-  <w:abstractNum w:abstractNumId="24" w15:restartNumberingAfterBreak="0">
+  <w:abstractNum w:abstractNumId="25" w15:restartNumberingAfterBreak="0">
     <w:nsid w:val="5C951020"/>
     <w:multiLevelType w:val="multilevel"/>
     <w:tmpl w:val="B8BEE908"/>
@@ -20593,7 +20899,7 @@
       </w:rPr>
     </w:lvl>
   </w:abstractNum>
-  <w:abstractNum w:abstractNumId="25" w15:restartNumberingAfterBreak="0">
+  <w:abstractNum w:abstractNumId="26" w15:restartNumberingAfterBreak="0">
     <w:nsid w:val="60ED22C2"/>
     <w:multiLevelType w:val="multilevel"/>
     <w:tmpl w:val="4A0406F4"/>
@@ -20742,7 +21048,7 @@
       </w:rPr>
     </w:lvl>
   </w:abstractNum>
-  <w:abstractNum w:abstractNumId="26" w15:restartNumberingAfterBreak="0">
+  <w:abstractNum w:abstractNumId="27" w15:restartNumberingAfterBreak="0">
     <w:nsid w:val="6DB50DCE"/>
     <w:multiLevelType w:val="multilevel"/>
     <w:tmpl w:val="438A8F6C"/>
@@ -20891,7 +21197,7 @@
       </w:rPr>
     </w:lvl>
   </w:abstractNum>
-  <w:abstractNum w:abstractNumId="27" w15:restartNumberingAfterBreak="0">
+  <w:abstractNum w:abstractNumId="28" w15:restartNumberingAfterBreak="0">
     <w:nsid w:val="6DC856A2"/>
     <w:multiLevelType w:val="multilevel"/>
     <w:tmpl w:val="80BABF78"/>
@@ -21059,16 +21365,16 @@
     <w:abstractNumId w:val="0"/>
   </w:num>
   <w:num w:numId="7">
-    <w:abstractNumId w:val="22"/>
+    <w:abstractNumId w:val="23"/>
   </w:num>
   <w:num w:numId="8">
-    <w:abstractNumId w:val="14"/>
+    <w:abstractNumId w:val="15"/>
   </w:num>
   <w:num w:numId="9">
     <w:abstractNumId w:val="8"/>
   </w:num>
   <w:num w:numId="10">
-    <w:abstractNumId w:val="17"/>
+    <w:abstractNumId w:val="18"/>
   </w:num>
   <w:num w:numId="11">
     <w:abstractNumId w:val="11"/>
@@ -21077,52 +21383,55 @@
     <w:abstractNumId w:val="10"/>
   </w:num>
   <w:num w:numId="13">
-    <w:abstractNumId w:val="24"/>
+    <w:abstractNumId w:val="25"/>
   </w:num>
   <w:num w:numId="14">
-    <w:abstractNumId w:val="16"/>
+    <w:abstractNumId w:val="17"/>
   </w:num>
   <w:num w:numId="15">
-    <w:abstractNumId w:val="20"/>
+    <w:abstractNumId w:val="21"/>
   </w:num>
   <w:num w:numId="16">
-    <w:abstractNumId w:val="25"/>
+    <w:abstractNumId w:val="26"/>
   </w:num>
   <w:num w:numId="17">
-    <w:abstractNumId w:val="15"/>
+    <w:abstractNumId w:val="16"/>
   </w:num>
   <w:num w:numId="18">
     <w:abstractNumId w:val="9"/>
   </w:num>
   <w:num w:numId="19">
-    <w:abstractNumId w:val="13"/>
+    <w:abstractNumId w:val="14"/>
   </w:num>
   <w:num w:numId="20">
+    <w:abstractNumId w:val="20"/>
+  </w:num>
+  <w:num w:numId="21">
+    <w:abstractNumId w:val="22"/>
+  </w:num>
+  <w:num w:numId="22">
     <w:abstractNumId w:val="19"/>
   </w:num>
-  <w:num w:numId="21">
-    <w:abstractNumId w:val="21"/>
-  </w:num>
-  <w:num w:numId="22">
-    <w:abstractNumId w:val="18"/>
-  </w:num>
   <w:num w:numId="23">
-    <w:abstractNumId w:val="23"/>
+    <w:abstractNumId w:val="24"/>
   </w:num>
   <w:num w:numId="24">
     <w:abstractNumId w:val="12"/>
   </w:num>
   <w:num w:numId="25">
-    <w:abstractNumId w:val="27"/>
+    <w:abstractNumId w:val="28"/>
   </w:num>
   <w:num w:numId="26">
     <w:abstractNumId w:val="7"/>
   </w:num>
   <w:num w:numId="27">
-    <w:abstractNumId w:val="26"/>
+    <w:abstractNumId w:val="27"/>
   </w:num>
   <w:num w:numId="28">
     <w:abstractNumId w:val="6"/>
+  </w:num>
+  <w:num w:numId="29">
+    <w:abstractNumId w:val="13"/>
   </w:num>
   <w:numIdMacAtCleanup w:val="24"/>
 </w:numbering>
@@ -32750,6 +33059,14 @@
       <w:u w:val="single"/>
     </w:rPr>
   </w:style>
+  <w:style w:type="paragraph" w:customStyle="1" w:styleId="gjcqjg1a">
+    <w:name w:val="gjcqjg1a"/>
+    <w:basedOn w:val="Normal"/>
+    <w:rsid w:val="004139B6"/>
+    <w:pPr>
+      <w:spacing w:before="100" w:beforeAutospacing="1" w:after="100" w:afterAutospacing="1"/>
+    </w:pPr>
+  </w:style>
 </w:styles>
 </file>
 
@@ -33078,7 +33395,7 @@
 </file>
 
 <file path=customXml/itemProps1.xml><?xml version="1.0" encoding="utf-8"?>
-<ds:datastoreItem xmlns:ds="http://schemas.openxmlformats.org/officeDocument/2006/customXml" ds:itemID="{5B1B3B16-E7D8-44F6-89D6-674A2135A91B}">
+<ds:datastoreItem xmlns:ds="http://schemas.openxmlformats.org/officeDocument/2006/customXml" ds:itemID="{CDAD6E8B-FAA8-4F02-B470-1BD5A988A9A1}">
   <ds:schemaRefs>
     <ds:schemaRef ds:uri="http://schemas.openxmlformats.org/officeDocument/2006/bibliography"/>
   </ds:schemaRefs>

</xml_diff>